<commit_message>
Xand Avião: revisão crítica da Parte 4
Co-Authored-By: Claude Opus 5.5 <noreply@anthropic.com>
Claude-Session: https://claude.ai/code/session_01MJjUEEZrxQDEUifKK2vj9g
</commit_message>
<xml_diff>
--- a/roteiros/xand-aviao/XandAviao_Parte4.docx
+++ b/roteiros/xand-aviao/XandAviao_Parte4.docx
@@ -127,7 +127,7 @@
         <w:rPr>
           <w:color w:val="1F4EB4"/>
         </w:rPr>
-        <w:t>Xand era sócio da banda. Naquela briga, os dois estavam em lados opostos.</w:t>
+        <w:t>E Xand continuava sendo o rosto da banda que agora cobrava milhões de Solange.</w:t>
       </w:r>
     </w:p>
     <w:p>
@@ -191,7 +191,7 @@
         <w:rPr>
           <w:color w:val="000000"/>
         </w:rPr>
-        <w:t>Enquanto isso, a amizade entre os dois tinha acabado de vez.</w:t>
+        <w:t>Enquanto isso, a amizade entre os dois estava em pedaços.</w:t>
       </w:r>
     </w:p>
     <w:p>
@@ -223,7 +223,7 @@
         <w:rPr>
           <w:color w:val="000000"/>
         </w:rPr>
-        <w:t>"A gente tem que ser amigo pra sempre", disse.</w:t>
+        <w:t>"Temos que ser amigos pra sempre", disse.</w:t>
       </w:r>
     </w:p>
     <w:p>
@@ -303,15 +303,7 @@
         <w:rPr>
           <w:color w:val="000000"/>
         </w:rPr>
-        <w:t>No fim, a produção anunciou um número impressionante. Quatrocentas e cinquenta e sete toneladas de alimentos.</w:t>
-      </w:r>
-    </w:p>
-    <w:p>
-      <w:r>
-        <w:rPr>
-          <w:color w:val="000000"/>
-        </w:rPr>
-        <w:t>Um número anunciado como vitória. Quatrocentas e cinquenta e sete toneladas.</w:t>
+        <w:t>No fim, a produção anunciou um número impressionante, apresentado como vitória. Quatrocentas e cinquenta e sete toneladas de alimentos.</w:t>
       </w:r>
     </w:p>
     <w:p>
@@ -343,7 +335,7 @@
         <w:rPr>
           <w:color w:val="000000"/>
         </w:rPr>
-        <w:t>A acusação nunca foi comprovada. Mas ficou grudada no nome dele.</w:t>
+        <w:t>Nenhuma prova pública confirmou a acusação. Mas ela ficou grudada no nome dele.</w:t>
       </w:r>
     </w:p>
     <w:p>
@@ -439,7 +431,7 @@
         <w:rPr>
           <w:color w:val="000000"/>
         </w:rPr>
-        <w:t>Em outra ocasião, outro ponto da vida dele virou alvo. O pai.</w:t>
+        <w:t>Em outro momento, as críticas chegaram ao pai dele.</w:t>
       </w:r>
     </w:p>
     <w:p>

</xml_diff>